<commit_message>
chore: Update PostgreSQL version to 17 across documentation and configuration files
</commit_message>
<xml_diff>
--- a/docs/specs/architecture.docx
+++ b/docs/specs/architecture.docx
@@ -49,13 +49,7 @@
         <w:t xml:space="preserve">Version:</w:t>
       </w:r>
       <w:r>
-        <w:t xml:space="preserve"> </w:t>
-      </w:r>
-      <w:r>
-        <w:t xml:space="preserve">0.2 (draft for review)</w:t>
-      </w:r>
-      <w:r>
-        <w:t xml:space="preserve"> </w:t>
+        <w:t xml:space="preserve"> 0.2 (draft for review) </w:t>
       </w:r>
       <w:r>
         <w:rPr>
@@ -64,13 +58,7 @@
         <w:t xml:space="preserve">Owner:</w:t>
       </w:r>
       <w:r>
-        <w:t xml:space="preserve"> </w:t>
-      </w:r>
-      <w:r>
-        <w:t xml:space="preserve">Ihor</w:t>
-      </w:r>
-      <w:r>
-        <w:t xml:space="preserve"> </w:t>
+        <w:t xml:space="preserve"> Ihor </w:t>
       </w:r>
       <w:r>
         <w:rPr>
@@ -79,13 +67,7 @@
         <w:t xml:space="preserve">Date:</w:t>
       </w:r>
       <w:r>
-        <w:t xml:space="preserve"> </w:t>
-      </w:r>
-      <w:r>
-        <w:t xml:space="preserve">2026-04-18</w:t>
-      </w:r>
-      <w:r>
-        <w:t xml:space="preserve"> </w:t>
+        <w:t xml:space="preserve"> 2026-04-18 </w:t>
       </w:r>
       <w:r>
         <w:rPr>
@@ -94,10 +76,7 @@
         <w:t xml:space="preserve">Status:</w:t>
       </w:r>
       <w:r>
-        <w:t xml:space="preserve"> </w:t>
-      </w:r>
-      <w:r>
-        <w:t xml:space="preserve">Draft</w:t>
+        <w:t xml:space="preserve"> Draft</w:t>
       </w:r>
     </w:p>
     <w:p>
@@ -483,7 +462,7 @@
               <w:jc w:val="left"/>
             </w:pPr>
             <w:r>
-              <w:t xml:space="preserve">PostgreSQL 15 (Cloud SQL) + pgvector</w:t>
+              <w:t xml:space="preserve">PostgreSQL 17 (Cloud SQL) + pgvector</w:t>
             </w:r>
           </w:p>
         </w:tc>
@@ -742,16 +721,7 @@
         <w:pStyle w:val="FirstParagraph"/>
       </w:pPr>
       <w:r>
-        <w:t xml:space="preserve">One application with three role-specific surfaces:</w:t>
-      </w:r>
-      <w:r>
-        <w:t xml:space="preserve"> </w:t>
-      </w:r>
-      <w:r>
-        <w:t xml:space="preserve">-</w:t>
-      </w:r>
-      <w:r>
-        <w:t xml:space="preserve"> </w:t>
+        <w:t xml:space="preserve">One application with three role-specific surfaces: - </w:t>
       </w:r>
       <w:r>
         <w:rPr>
@@ -760,19 +730,7 @@
         <w:t xml:space="preserve">Recruiter</w:t>
       </w:r>
       <w:r>
-        <w:t xml:space="preserve"> </w:t>
-      </w:r>
-      <w:r>
-        <w:t xml:space="preserve">— Position Template authoring, InterviewPlan generation and review</w:t>
-      </w:r>
-      <w:r>
-        <w:t xml:space="preserve"> </w:t>
-      </w:r>
-      <w:r>
-        <w:t xml:space="preserve">-</w:t>
-      </w:r>
-      <w:r>
-        <w:t xml:space="preserve"> </w:t>
+        <w:t xml:space="preserve"> — Position Template authoring, InterviewPlan generation and review - </w:t>
       </w:r>
       <w:r>
         <w:rPr>
@@ -781,19 +739,7 @@
         <w:t xml:space="preserve">Candidate</w:t>
       </w:r>
       <w:r>
-        <w:t xml:space="preserve"> </w:t>
-      </w:r>
-      <w:r>
-        <w:t xml:space="preserve">— token-authorized interview session (chat UI)</w:t>
-      </w:r>
-      <w:r>
-        <w:t xml:space="preserve"> </w:t>
-      </w:r>
-      <w:r>
-        <w:t xml:space="preserve">-</w:t>
-      </w:r>
-      <w:r>
-        <w:t xml:space="preserve"> </w:t>
+        <w:t xml:space="preserve"> — token-authorized interview session (chat UI) - </w:t>
       </w:r>
       <w:r>
         <w:rPr>
@@ -802,10 +748,7 @@
         <w:t xml:space="preserve">Reviewer</w:t>
       </w:r>
       <w:r>
-        <w:t xml:space="preserve"> </w:t>
-      </w:r>
-      <w:r>
-        <w:t xml:space="preserve">— post-interview review, turn annotation, AssessmentCorrection</w:t>
+        <w:t xml:space="preserve"> — post-interview review, turn annotation, AssessmentCorrection</w:t>
       </w:r>
     </w:p>
     <w:p>
@@ -901,10 +844,7 @@
         <w:pStyle w:val="FirstParagraph"/>
       </w:pPr>
       <w:r>
-        <w:t xml:space="preserve">Deterministic Python code —</w:t>
-      </w:r>
-      <w:r>
-        <w:t xml:space="preserve"> </w:t>
+        <w:t xml:space="preserve">Deterministic Python code — </w:t>
       </w:r>
       <w:r>
         <w:rPr>
@@ -913,19 +853,7 @@
         <w:t xml:space="preserve">not</w:t>
       </w:r>
       <w:r>
-        <w:t xml:space="preserve"> </w:t>
-      </w:r>
-      <w:r>
-        <w:t xml:space="preserve">an LLM:</w:t>
-      </w:r>
-      <w:r>
-        <w:t xml:space="preserve"> </w:t>
-      </w:r>
-      <w:r>
-        <w:t xml:space="preserve">- A session moves through phases:</w:t>
-      </w:r>
-      <w:r>
-        <w:t xml:space="preserve"> </w:t>
+        <w:t xml:space="preserve"> an LLM: - A session moves through phases: </w:t>
       </w:r>
       <w:r>
         <w:rPr>
@@ -934,13 +862,7 @@
         <w:t xml:space="preserve">INTRO</w:t>
       </w:r>
       <w:r>
-        <w:t xml:space="preserve"> </w:t>
-      </w:r>
-      <w:r>
-        <w:t xml:space="preserve">→</w:t>
-      </w:r>
-      <w:r>
-        <w:t xml:space="preserve"> </w:t>
+        <w:t xml:space="preserve"> → </w:t>
       </w:r>
       <w:r>
         <w:rPr>
@@ -949,13 +871,7 @@
         <w:t xml:space="preserve">TECH</w:t>
       </w:r>
       <w:r>
-        <w:t xml:space="preserve"> </w:t>
-      </w:r>
-      <w:r>
-        <w:t xml:space="preserve">(per competency → per topic → probes) →</w:t>
-      </w:r>
-      <w:r>
-        <w:t xml:space="preserve"> </w:t>
+        <w:t xml:space="preserve"> (per competency → per topic → probes) → </w:t>
       </w:r>
       <w:r>
         <w:rPr>
@@ -964,13 +880,7 @@
         <w:t xml:space="preserve">QA</w:t>
       </w:r>
       <w:r>
-        <w:t xml:space="preserve"> </w:t>
-      </w:r>
-      <w:r>
-        <w:t xml:space="preserve">→</w:t>
-      </w:r>
-      <w:r>
-        <w:t xml:space="preserve"> </w:t>
+        <w:t xml:space="preserve"> → </w:t>
       </w:r>
       <w:r>
         <w:rPr>
@@ -979,19 +889,7 @@
         <w:t xml:space="preserve">CLOSE</w:t>
       </w:r>
       <w:r>
-        <w:t xml:space="preserve"> </w:t>
-      </w:r>
-      <w:r>
-        <w:t xml:space="preserve">- Decides when to call Interviewer vs Assessor</w:t>
-      </w:r>
-      <w:r>
-        <w:t xml:space="preserve"> </w:t>
-      </w:r>
-      <w:r>
-        <w:t xml:space="preserve">- Honors</w:t>
-      </w:r>
-      <w:r>
-        <w:t xml:space="preserve"> </w:t>
+        <w:t xml:space="preserve"> - Decides when to call Interviewer vs Assessor - Honors </w:t>
       </w:r>
       <w:r>
         <w:rPr>
@@ -1000,13 +898,7 @@
         <w:t xml:space="preserve">plan.priority</w:t>
       </w:r>
       <w:r>
-        <w:t xml:space="preserve"> </w:t>
-      </w:r>
-      <w:r>
-        <w:t xml:space="preserve">(must_cover vs nice_to_have) and (from Phase 2)</w:t>
-      </w:r>
-      <w:r>
-        <w:t xml:space="preserve"> </w:t>
+        <w:t xml:space="preserve"> (must_cover vs nice_to_have) and (from Phase 2) </w:t>
       </w:r>
       <w:r>
         <w:rPr>
@@ -1015,19 +907,7 @@
         <w:t xml:space="preserve">skip_rules</w:t>
       </w:r>
       <w:r>
-        <w:t xml:space="preserve"> </w:t>
-      </w:r>
-      <w:r>
-        <w:t xml:space="preserve">- Persists TurnTrace after every agent call</w:t>
-      </w:r>
-      <w:r>
-        <w:t xml:space="preserve"> </w:t>
-      </w:r>
-      <w:r>
-        <w:t xml:space="preserve">- Transitions are pure functions:</w:t>
-      </w:r>
-      <w:r>
-        <w:t xml:space="preserve"> </w:t>
+        <w:t xml:space="preserve"> - Persists TurnTrace after every agent call - Transitions are pure functions: </w:t>
       </w:r>
       <w:r>
         <w:rPr>
@@ -1036,10 +916,7 @@
         <w:t xml:space="preserve">(current_state, event) → new_state</w:t>
       </w:r>
       <w:r>
-        <w:t xml:space="preserve"> </w:t>
-      </w:r>
-      <w:r>
-        <w:t xml:space="preserve">- Timeouts, retries, and recovery are the orchestrator’s responsibility — not the agents’</w:t>
+        <w:t xml:space="preserve"> - Timeouts, retries, and recovery are the orchestrator’s responsibility — not the agents’</w:t>
       </w:r>
     </w:p>
     <w:p>
@@ -1053,10 +930,7 @@
         <w:t xml:space="preserve">Why deterministic rather than LLM-driven orchestration.</w:t>
       </w:r>
       <w:r>
-        <w:t xml:space="preserve"> </w:t>
-      </w:r>
-      <w:r>
-        <w:t xml:space="preserve">Predictability, reproducibility, unit-testability. LLM-orchestration is just another agent with poor observability.</w:t>
+        <w:t xml:space="preserve"> Predictability, reproducibility, unit-testability. LLM-orchestration is just another agent with poor observability.</w:t>
       </w:r>
     </w:p>
     <w:p>
@@ -1088,25 +962,7 @@
         <w:t xml:space="preserve">Interviewer Agent.</w:t>
       </w:r>
       <w:r>
-        <w:t xml:space="preserve"> </w:t>
-      </w:r>
-      <w:r>
-        <w:t xml:space="preserve">Drives the conversation and generates turns.</w:t>
-      </w:r>
-      <w:r>
-        <w:t xml:space="preserve"> </w:t>
-      </w:r>
-      <w:r>
-        <w:t xml:space="preserve">- Model: Gemini 2.5 Flash (speed is critical for in-turn latency)</w:t>
-      </w:r>
-      <w:r>
-        <w:t xml:space="preserve"> </w:t>
-      </w:r>
-      <w:r>
-        <w:t xml:space="preserve">- Output: structured JSON with</w:t>
-      </w:r>
-      <w:r>
-        <w:t xml:space="preserve"> </w:t>
+        <w:t xml:space="preserve"> Drives the conversation and generates turns. - Model: Gemini 2.5 Flash (speed is critical for in-turn latency) - Output: structured JSON with </w:t>
       </w:r>
       <w:r>
         <w:rPr>
@@ -1115,10 +971,7 @@
         <w:t xml:space="preserve">message_to_candidate</w:t>
       </w:r>
       <w:r>
-        <w:t xml:space="preserve"> </w:t>
-      </w:r>
-      <w:r>
-        <w:t xml:space="preserve">plus metadata (</w:t>
+        <w:t xml:space="preserve"> plus metadata (</w:t>
       </w:r>
       <w:r>
         <w:rPr>
@@ -1127,10 +980,7 @@
         <w:t xml:space="preserve">targeted_topic_id</w:t>
       </w:r>
       <w:r>
-        <w:t xml:space="preserve">,</w:t>
-      </w:r>
-      <w:r>
-        <w:t xml:space="preserve"> </w:t>
+        <w:t xml:space="preserve">, </w:t>
       </w:r>
       <w:r>
         <w:rPr>
@@ -1139,10 +989,7 @@
         <w:t xml:space="preserve">expected_concepts</w:t>
       </w:r>
       <w:r>
-        <w:t xml:space="preserve">,</w:t>
-      </w:r>
-      <w:r>
-        <w:t xml:space="preserve"> </w:t>
+        <w:t xml:space="preserve">, </w:t>
       </w:r>
       <w:r>
         <w:rPr>
@@ -1151,10 +998,7 @@
         <w:t xml:space="preserve">suggested_next_action</w:t>
       </w:r>
       <w:r>
-        <w:t xml:space="preserve">,</w:t>
-      </w:r>
-      <w:r>
-        <w:t xml:space="preserve"> </w:t>
+        <w:t xml:space="preserve">, </w:t>
       </w:r>
       <w:r>
         <w:rPr>
@@ -1163,16 +1007,7 @@
         <w:t xml:space="preserve">self_checks</w:t>
       </w:r>
       <w:r>
-        <w:t xml:space="preserve">)</w:t>
-      </w:r>
-      <w:r>
-        <w:t xml:space="preserve"> </w:t>
-      </w:r>
-      <w:r>
-        <w:t xml:space="preserve">- Prompt:</w:t>
-      </w:r>
-      <w:r>
-        <w:t xml:space="preserve"> </w:t>
+        <w:t xml:space="preserve">) - Prompt: </w:t>
       </w:r>
       <w:r>
         <w:rPr>
@@ -1181,16 +1016,7 @@
         <w:t xml:space="preserve">prompts/interviewer.md</w:t>
       </w:r>
       <w:r>
-        <w:t xml:space="preserve"> </w:t>
-      </w:r>
-      <w:r>
-        <w:t xml:space="preserve">(semver-versioned)</w:t>
-      </w:r>
-      <w:r>
-        <w:t xml:space="preserve"> </w:t>
-      </w:r>
-      <w:r>
-        <w:t xml:space="preserve">- Ukrainian output, English system prompt</w:t>
+        <w:t xml:space="preserve"> (semver-versioned) - Ukrainian output, English system prompt</w:t>
       </w:r>
     </w:p>
     <w:p>
@@ -1204,25 +1030,7 @@
         <w:t xml:space="preserve">Assessor Agent.</w:t>
       </w:r>
       <w:r>
-        <w:t xml:space="preserve"> </w:t>
-      </w:r>
-      <w:r>
-        <w:t xml:space="preserve">Scores each candidate answer.</w:t>
-      </w:r>
-      <w:r>
-        <w:t xml:space="preserve"> </w:t>
-      </w:r>
-      <w:r>
-        <w:t xml:space="preserve">- Model: Gemini 2.5 Pro (quality-critical); A/B with Claude Sonnet 4.6 during W10 calibration</w:t>
-      </w:r>
-      <w:r>
-        <w:t xml:space="preserve"> </w:t>
-      </w:r>
-      <w:r>
-        <w:t xml:space="preserve">- Output: structured JSON —</w:t>
-      </w:r>
-      <w:r>
-        <w:t xml:space="preserve"> </w:t>
+        <w:t xml:space="preserve"> Scores each candidate answer. - Model: Gemini 2.5 Pro (quality-critical); A/B with Claude Sonnet 4.6 during W10 calibration - Output: structured JSON — </w:t>
       </w:r>
       <w:r>
         <w:rPr>
@@ -1231,10 +1039,7 @@
         <w:t xml:space="preserve">concepts_assessment[]</w:t>
       </w:r>
       <w:r>
-        <w:t xml:space="preserve">,</w:t>
-      </w:r>
-      <w:r>
-        <w:t xml:space="preserve"> </w:t>
+        <w:t xml:space="preserve">, </w:t>
       </w:r>
       <w:r>
         <w:rPr>
@@ -1243,10 +1048,7 @@
         <w:t xml:space="preserve">red_flags[]</w:t>
       </w:r>
       <w:r>
-        <w:t xml:space="preserve">,</w:t>
-      </w:r>
-      <w:r>
-        <w:t xml:space="preserve"> </w:t>
+        <w:t xml:space="preserve">, </w:t>
       </w:r>
       <w:r>
         <w:rPr>
@@ -1255,10 +1057,7 @@
         <w:t xml:space="preserve">confidence</w:t>
       </w:r>
       <w:r>
-        <w:t xml:space="preserve">,</w:t>
-      </w:r>
-      <w:r>
-        <w:t xml:space="preserve"> </w:t>
+        <w:t xml:space="preserve">, </w:t>
       </w:r>
       <w:r>
         <w:rPr>
@@ -1267,13 +1066,7 @@
         <w:t xml:space="preserve">level_demonstrated</w:t>
       </w:r>
       <w:r>
-        <w:t xml:space="preserve"> </w:t>
-      </w:r>
-      <w:r>
-        <w:t xml:space="preserve">- Prompt:</w:t>
-      </w:r>
-      <w:r>
-        <w:t xml:space="preserve"> </w:t>
+        <w:t xml:space="preserve"> - Prompt: </w:t>
       </w:r>
       <w:r>
         <w:rPr>
@@ -1282,10 +1075,7 @@
         <w:t xml:space="preserve">prompts/assessor.md</w:t>
       </w:r>
       <w:r>
-        <w:t xml:space="preserve"> </w:t>
-      </w:r>
-      <w:r>
-        <w:t xml:space="preserve">- Mode: async — does not block the next Interviewer turn (voice-ready)</w:t>
+        <w:t xml:space="preserve"> - Mode: async — does not block the next Interviewer turn (voice-ready)</w:t>
       </w:r>
     </w:p>
     <w:p>
@@ -1299,22 +1089,7 @@
         <w:t xml:space="preserve">PreInterviewPlanner Agent.</w:t>
       </w:r>
       <w:r>
-        <w:t xml:space="preserve"> </w:t>
-      </w:r>
-      <w:r>
-        <w:t xml:space="preserve">Generates an InterviewPlan from Position Template + rubric snapshot.</w:t>
-      </w:r>
-      <w:r>
-        <w:t xml:space="preserve"> </w:t>
-      </w:r>
-      <w:r>
-        <w:t xml:space="preserve">- Model: Gemini 2.5 Pro (runs once per session; quality matters)</w:t>
-      </w:r>
-      <w:r>
-        <w:t xml:space="preserve"> </w:t>
-      </w:r>
-      <w:r>
-        <w:t xml:space="preserve">- Output: structured JSON plan (</w:t>
+        <w:t xml:space="preserve"> Generates an InterviewPlan from Position Template + rubric snapshot. - Model: Gemini 2.5 Pro (runs once per session; quality matters) - Output: structured JSON plan (</w:t>
       </w:r>
       <w:r>
         <w:rPr>
@@ -1323,16 +1098,7 @@
         <w:t xml:space="preserve">competency_order</w:t>
       </w:r>
       <w:r>
-        <w:t xml:space="preserve">, topics, seed questions, time budget)</w:t>
-      </w:r>
-      <w:r>
-        <w:t xml:space="preserve"> </w:t>
-      </w:r>
-      <w:r>
-        <w:t xml:space="preserve">- Prompt:</w:t>
-      </w:r>
-      <w:r>
-        <w:t xml:space="preserve"> </w:t>
+        <w:t xml:space="preserve">, topics, seed questions, time budget) - Prompt: </w:t>
       </w:r>
       <w:r>
         <w:rPr>
@@ -1352,40 +1118,7 @@
         <w:t xml:space="preserve">Vertex client wrapper (shared):</w:t>
       </w:r>
       <w:r>
-        <w:t xml:space="preserve"> </w:t>
-      </w:r>
-      <w:r>
-        <w:t xml:space="preserve">- Retries with exponential backoff on transient failures</w:t>
-      </w:r>
-      <w:r>
-        <w:t xml:space="preserve"> </w:t>
-      </w:r>
-      <w:r>
-        <w:t xml:space="preserve">- Pydantic schema validation on output</w:t>
-      </w:r>
-      <w:r>
-        <w:t xml:space="preserve"> </w:t>
-      </w:r>
-      <w:r>
-        <w:t xml:space="preserve">- Automatic one-shot retry on schema mismatch</w:t>
-      </w:r>
-      <w:r>
-        <w:t xml:space="preserve"> </w:t>
-      </w:r>
-      <w:r>
-        <w:t xml:space="preserve">- Role-specific timeouts</w:t>
-      </w:r>
-      <w:r>
-        <w:t xml:space="preserve"> </w:t>
-      </w:r>
-      <w:r>
-        <w:t xml:space="preserve">- Cost tracking middleware</w:t>
-      </w:r>
-      <w:r>
-        <w:t xml:space="preserve"> </w:t>
-      </w:r>
-      <w:r>
-        <w:t xml:space="preserve">- Prompt caching (Vertex feature) for system prompts</w:t>
+        <w:t xml:space="preserve"> - Retries with exponential backoff on transient failures - Pydantic schema validation on output - Automatic one-shot retry on schema mismatch - Role-specific timeouts - Cost tracking middleware - Prompt caching (Vertex feature) for system prompts</w:t>
       </w:r>
     </w:p>
     <w:p>
@@ -1409,13 +1142,7 @@
         <w:t xml:space="preserve">PostgreSQL tables (high level; details in Data Model):</w:t>
       </w:r>
       <w:r>
-        <w:t xml:space="preserve"> </w:t>
-      </w:r>
-      <w:r>
-        <w:t xml:space="preserve">-</w:t>
-      </w:r>
-      <w:r>
-        <w:t xml:space="preserve"> </w:t>
+        <w:t xml:space="preserve"> - </w:t>
       </w:r>
       <w:r>
         <w:rPr>
@@ -1424,10 +1151,7 @@
         <w:t xml:space="preserve">users</w:t>
       </w:r>
       <w:r>
-        <w:t xml:space="preserve">,</w:t>
-      </w:r>
-      <w:r>
-        <w:t xml:space="preserve"> </w:t>
+        <w:t xml:space="preserve">, </w:t>
       </w:r>
       <w:r>
         <w:rPr>
@@ -1436,13 +1160,7 @@
         <w:t xml:space="preserve">candidates</w:t>
       </w:r>
       <w:r>
-        <w:t xml:space="preserve"> </w:t>
-      </w:r>
-      <w:r>
-        <w:t xml:space="preserve">- Rubric tree:</w:t>
-      </w:r>
-      <w:r>
-        <w:t xml:space="preserve"> </w:t>
+        <w:t xml:space="preserve"> - Rubric tree: </w:t>
       </w:r>
       <w:r>
         <w:rPr>
@@ -1451,10 +1169,7 @@
         <w:t xml:space="preserve">stack</w:t>
       </w:r>
       <w:r>
-        <w:t xml:space="preserve">,</w:t>
-      </w:r>
-      <w:r>
-        <w:t xml:space="preserve"> </w:t>
+        <w:t xml:space="preserve">, </w:t>
       </w:r>
       <w:r>
         <w:rPr>
@@ -1463,10 +1178,7 @@
         <w:t xml:space="preserve">competency_block</w:t>
       </w:r>
       <w:r>
-        <w:t xml:space="preserve">,</w:t>
-      </w:r>
-      <w:r>
-        <w:t xml:space="preserve"> </w:t>
+        <w:t xml:space="preserve">, </w:t>
       </w:r>
       <w:r>
         <w:rPr>
@@ -1475,10 +1187,7 @@
         <w:t xml:space="preserve">competency</w:t>
       </w:r>
       <w:r>
-        <w:t xml:space="preserve">,</w:t>
-      </w:r>
-      <w:r>
-        <w:t xml:space="preserve"> </w:t>
+        <w:t xml:space="preserve">, </w:t>
       </w:r>
       <w:r>
         <w:rPr>
@@ -1487,10 +1196,7 @@
         <w:t xml:space="preserve">topic</w:t>
       </w:r>
       <w:r>
-        <w:t xml:space="preserve">,</w:t>
-      </w:r>
-      <w:r>
-        <w:t xml:space="preserve"> </w:t>
+        <w:t xml:space="preserve">, </w:t>
       </w:r>
       <w:r>
         <w:rPr>
@@ -1499,10 +1205,7 @@
         <w:t xml:space="preserve">level</w:t>
       </w:r>
       <w:r>
-        <w:t xml:space="preserve">,</w:t>
-      </w:r>
-      <w:r>
-        <w:t xml:space="preserve"> </w:t>
+        <w:t xml:space="preserve">, </w:t>
       </w:r>
       <w:r>
         <w:rPr>
@@ -1511,13 +1214,7 @@
         <w:t xml:space="preserve">reference</w:t>
       </w:r>
       <w:r>
-        <w:t xml:space="preserve"> </w:t>
-      </w:r>
-      <w:r>
-        <w:t xml:space="preserve">-</w:t>
-      </w:r>
-      <w:r>
-        <w:t xml:space="preserve"> </w:t>
+        <w:t xml:space="preserve"> - </w:t>
       </w:r>
       <w:r>
         <w:rPr>
@@ -1526,13 +1223,7 @@
         <w:t xml:space="preserve">position_template</w:t>
       </w:r>
       <w:r>
-        <w:t xml:space="preserve"> </w:t>
-      </w:r>
-      <w:r>
-        <w:t xml:space="preserve">-</w:t>
-      </w:r>
-      <w:r>
-        <w:t xml:space="preserve"> </w:t>
+        <w:t xml:space="preserve"> - </w:t>
       </w:r>
       <w:r>
         <w:rPr>
@@ -1541,13 +1232,7 @@
         <w:t xml:space="preserve">interview_session</w:t>
       </w:r>
       <w:r>
-        <w:t xml:space="preserve"> </w:t>
-      </w:r>
-      <w:r>
-        <w:t xml:space="preserve">(with</w:t>
-      </w:r>
-      <w:r>
-        <w:t xml:space="preserve"> </w:t>
+        <w:t xml:space="preserve"> (with </w:t>
       </w:r>
       <w:r>
         <w:rPr>
@@ -1556,19 +1241,7 @@
         <w:t xml:space="preserve">rubric_snapshot</w:t>
       </w:r>
       <w:r>
-        <w:t xml:space="preserve"> </w:t>
-      </w:r>
-      <w:r>
-        <w:t xml:space="preserve">JSONB)</w:t>
-      </w:r>
-      <w:r>
-        <w:t xml:space="preserve"> </w:t>
-      </w:r>
-      <w:r>
-        <w:t xml:space="preserve">-</w:t>
-      </w:r>
-      <w:r>
-        <w:t xml:space="preserve"> </w:t>
+        <w:t xml:space="preserve"> JSONB) - </w:t>
       </w:r>
       <w:r>
         <w:rPr>
@@ -1577,13 +1250,7 @@
         <w:t xml:space="preserve">interview_plan</w:t>
       </w:r>
       <w:r>
-        <w:t xml:space="preserve"> </w:t>
-      </w:r>
-      <w:r>
-        <w:t xml:space="preserve">(with</w:t>
-      </w:r>
-      <w:r>
-        <w:t xml:space="preserve"> </w:t>
+        <w:t xml:space="preserve"> (with </w:t>
       </w:r>
       <w:r>
         <w:rPr>
@@ -1592,19 +1259,7 @@
         <w:t xml:space="preserve">plan_json</w:t>
       </w:r>
       <w:r>
-        <w:t xml:space="preserve"> </w:t>
-      </w:r>
-      <w:r>
-        <w:t xml:space="preserve">JSONB; status draft / approved / frozen)</w:t>
-      </w:r>
-      <w:r>
-        <w:t xml:space="preserve"> </w:t>
-      </w:r>
-      <w:r>
-        <w:t xml:space="preserve">-</w:t>
-      </w:r>
-      <w:r>
-        <w:t xml:space="preserve"> </w:t>
+        <w:t xml:space="preserve"> JSONB; status draft / approved / frozen) - </w:t>
       </w:r>
       <w:r>
         <w:rPr>
@@ -1613,13 +1268,7 @@
         <w:t xml:space="preserve">message</w:t>
       </w:r>
       <w:r>
-        <w:t xml:space="preserve"> </w:t>
-      </w:r>
-      <w:r>
-        <w:t xml:space="preserve">/</w:t>
-      </w:r>
-      <w:r>
-        <w:t xml:space="preserve"> </w:t>
+        <w:t xml:space="preserve"> / </w:t>
       </w:r>
       <w:r>
         <w:rPr>
@@ -1628,13 +1277,7 @@
         <w:t xml:space="preserve">turn</w:t>
       </w:r>
       <w:r>
-        <w:t xml:space="preserve"> </w:t>
-      </w:r>
-      <w:r>
-        <w:t xml:space="preserve">-</w:t>
-      </w:r>
-      <w:r>
-        <w:t xml:space="preserve"> </w:t>
+        <w:t xml:space="preserve"> - </w:t>
       </w:r>
       <w:r>
         <w:rPr>
@@ -1643,19 +1286,7 @@
         <w:t xml:space="preserve">turn_trace</w:t>
       </w:r>
       <w:r>
-        <w:t xml:space="preserve"> </w:t>
-      </w:r>
-      <w:r>
-        <w:t xml:space="preserve">(full prompt / response, tokens, latency, cost)</w:t>
-      </w:r>
-      <w:r>
-        <w:t xml:space="preserve"> </w:t>
-      </w:r>
-      <w:r>
-        <w:t xml:space="preserve">-</w:t>
-      </w:r>
-      <w:r>
-        <w:t xml:space="preserve"> </w:t>
+        <w:t xml:space="preserve"> (full prompt / response, tokens, latency, cost) - </w:t>
       </w:r>
       <w:r>
         <w:rPr>
@@ -1664,19 +1295,7 @@
         <w:t xml:space="preserve">assessment</w:t>
       </w:r>
       <w:r>
-        <w:t xml:space="preserve"> </w:t>
-      </w:r>
-      <w:r>
-        <w:t xml:space="preserve">(per-turn and per-competency)</w:t>
-      </w:r>
-      <w:r>
-        <w:t xml:space="preserve"> </w:t>
-      </w:r>
-      <w:r>
-        <w:t xml:space="preserve">-</w:t>
-      </w:r>
-      <w:r>
-        <w:t xml:space="preserve"> </w:t>
+        <w:t xml:space="preserve"> (per-turn and per-competency) - </w:t>
       </w:r>
       <w:r>
         <w:rPr>
@@ -1685,13 +1304,7 @@
         <w:t xml:space="preserve">turn_annotation</w:t>
       </w:r>
       <w:r>
-        <w:t xml:space="preserve"> </w:t>
-      </w:r>
-      <w:r>
-        <w:t xml:space="preserve">-</w:t>
-      </w:r>
-      <w:r>
-        <w:t xml:space="preserve"> </w:t>
+        <w:t xml:space="preserve"> - </w:t>
       </w:r>
       <w:r>
         <w:rPr>
@@ -1700,13 +1313,7 @@
         <w:t xml:space="preserve">assessment_correction</w:t>
       </w:r>
       <w:r>
-        <w:t xml:space="preserve"> </w:t>
-      </w:r>
-      <w:r>
-        <w:t xml:space="preserve">-</w:t>
-      </w:r>
-      <w:r>
-        <w:t xml:space="preserve"> </w:t>
+        <w:t xml:space="preserve"> - </w:t>
       </w:r>
       <w:r>
         <w:rPr>
@@ -1726,19 +1333,7 @@
         <w:t xml:space="preserve">pgvector</w:t>
       </w:r>
       <w:r>
-        <w:t xml:space="preserve"> </w:t>
-      </w:r>
-      <w:r>
-        <w:t xml:space="preserve">— embeddings for RAG (feature-off in MVP):</w:t>
-      </w:r>
-      <w:r>
-        <w:t xml:space="preserve"> </w:t>
-      </w:r>
-      <w:r>
-        <w:t xml:space="preserve">-</w:t>
-      </w:r>
-      <w:r>
-        <w:t xml:space="preserve"> </w:t>
+        <w:t xml:space="preserve"> — embeddings for RAG (feature-off in MVP): - </w:t>
       </w:r>
       <w:r>
         <w:rPr>
@@ -1747,10 +1342,7 @@
         <w:t xml:space="preserve">annotated_turn_embedding(turn_id, topic_id, embedding vector(768))</w:t>
       </w:r>
       <w:r>
-        <w:t xml:space="preserve"> </w:t>
-      </w:r>
-      <w:r>
-        <w:t xml:space="preserve">- Indexed after reviewer approval</w:t>
+        <w:t xml:space="preserve"> - Indexed after reviewer approval</w:t>
       </w:r>
     </w:p>
     <w:p>
@@ -1768,16 +1360,7 @@
         <w:pStyle w:val="FirstParagraph"/>
       </w:pPr>
       <w:r>
-        <w:t xml:space="preserve">Three layers:</w:t>
-      </w:r>
-      <w:r>
-        <w:t xml:space="preserve"> </w:t>
-      </w:r>
-      <w:r>
-        <w:t xml:space="preserve">1.</w:t>
-      </w:r>
-      <w:r>
-        <w:t xml:space="preserve"> </w:t>
+        <w:t xml:space="preserve">Three layers: 1. </w:t>
       </w:r>
       <w:r>
         <w:rPr>
@@ -1786,19 +1369,7 @@
         <w:t xml:space="preserve">Application metrics</w:t>
       </w:r>
       <w:r>
-        <w:t xml:space="preserve"> </w:t>
-      </w:r>
-      <w:r>
-        <w:t xml:space="preserve">— Cloud Monitoring (latency, error rate, cost, active sessions)</w:t>
-      </w:r>
-      <w:r>
-        <w:t xml:space="preserve"> </w:t>
-      </w:r>
-      <w:r>
-        <w:t xml:space="preserve">2.</w:t>
-      </w:r>
-      <w:r>
-        <w:t xml:space="preserve"> </w:t>
+        <w:t xml:space="preserve"> — Cloud Monitoring (latency, error rate, cost, active sessions) 2. </w:t>
       </w:r>
       <w:r>
         <w:rPr>
@@ -1807,19 +1378,7 @@
         <w:t xml:space="preserve">TurnTrace store</w:t>
       </w:r>
       <w:r>
-        <w:t xml:space="preserve"> </w:t>
-      </w:r>
-      <w:r>
-        <w:t xml:space="preserve">— full record of every agent call in the DB (prompt, response, parsed output, tokens, latency, model, prompt_version)</w:t>
-      </w:r>
-      <w:r>
-        <w:t xml:space="preserve"> </w:t>
-      </w:r>
-      <w:r>
-        <w:t xml:space="preserve">3.</w:t>
-      </w:r>
-      <w:r>
-        <w:t xml:space="preserve"> </w:t>
+        <w:t xml:space="preserve"> — full record of every agent call in the DB (prompt, response, parsed output, tokens, latency, model, prompt_version) 3. </w:t>
       </w:r>
       <w:r>
         <w:rPr>
@@ -1828,10 +1387,7 @@
         <w:t xml:space="preserve">Dashboards</w:t>
       </w:r>
       <w:r>
-        <w:t xml:space="preserve"> </w:t>
-      </w:r>
-      <w:r>
-        <w:t xml:space="preserve">— per-agent views, per-session cost breakdown, overall health, model A/B comparison</w:t>
+        <w:t xml:space="preserve"> — per-agent views, per-session cost breakdown, overall health, model A/B comparison</w:t>
       </w:r>
     </w:p>
     <w:p>
@@ -1845,28 +1401,7 @@
         <w:t xml:space="preserve">Alerts:</w:t>
       </w:r>
       <w:r>
-        <w:t xml:space="preserve"> </w:t>
-      </w:r>
-      <w:r>
-        <w:t xml:space="preserve">- Cost per session exceeds threshold</w:t>
-      </w:r>
-      <w:r>
-        <w:t xml:space="preserve"> </w:t>
-      </w:r>
-      <w:r>
-        <w:t xml:space="preserve">- Agent p95 latency &gt; 15 s</w:t>
-      </w:r>
-      <w:r>
-        <w:t xml:space="preserve"> </w:t>
-      </w:r>
-      <w:r>
-        <w:t xml:space="preserve">- Error rate &gt; 5%</w:t>
-      </w:r>
-      <w:r>
-        <w:t xml:space="preserve"> </w:t>
-      </w:r>
-      <w:r>
-        <w:t xml:space="preserve">- TurnTrace capture gap (missing trace rows relative to messages)</w:t>
+        <w:t xml:space="preserve"> - Cost per session exceeds threshold - Agent p95 latency &gt; 15 s - Error rate &gt; 5% - TurnTrace capture gap (missing trace rows relative to messages)</w:t>
       </w:r>
     </w:p>
     <w:p>
@@ -1894,10 +1429,7 @@
         <w:t xml:space="preserve">Internal users</w:t>
       </w:r>
       <w:r>
-        <w:t xml:space="preserve"> </w:t>
-      </w:r>
-      <w:r>
-        <w:t xml:space="preserve">(recruiter, reviewer, admin) — Identity Platform + Google provider. HTTP-only session cookies. Roles as JWT claims.</w:t>
+        <w:t xml:space="preserve"> (recruiter, reviewer, admin) — Identity Platform + Google provider. HTTP-only session cookies. Roles as JWT claims.</w:t>
       </w:r>
     </w:p>
     <w:p>
@@ -1915,10 +1447,7 @@
         <w:t xml:space="preserve">Candidate</w:t>
       </w:r>
       <w:r>
-        <w:t xml:space="preserve"> </w:t>
-      </w:r>
-      <w:r>
-        <w:t xml:space="preserve">— magic-link token → short-lived session cookie. Token is single-use, invalidated after first use or by TTL (24 h).</w:t>
+        <w:t xml:space="preserve"> — magic-link token → short-lived session cookie. Token is single-use, invalidated after first use or by TTL (24 h).</w:t>
       </w:r>
     </w:p>
     <w:p>
@@ -2008,10 +1537,7 @@
         <w:pStyle w:val="BodyText"/>
       </w:pPr>
       <w:r>
-        <w:t xml:space="preserve">Key invariant: the previous rubric version remains; sessions holding a prior</w:t>
-      </w:r>
-      <w:r>
-        <w:t xml:space="preserve"> </w:t>
+        <w:t xml:space="preserve">Key invariant: the previous rubric version remains; sessions holding a prior </w:t>
       </w:r>
       <w:r>
         <w:rPr>
@@ -2020,10 +1546,7 @@
         <w:t xml:space="preserve">rubric_snapshot</w:t>
       </w:r>
       <w:r>
-        <w:t xml:space="preserve"> </w:t>
-      </w:r>
-      <w:r>
-        <w:t xml:space="preserve">are unaffected.</w:t>
+        <w:t xml:space="preserve"> are unaffected.</w:t>
       </w:r>
     </w:p>
     <w:p>
@@ -2161,16 +1684,7 @@
         <w:pStyle w:val="BodyText"/>
       </w:pPr>
       <w:r>
-        <w:t xml:space="preserve">Key details:</w:t>
-      </w:r>
-      <w:r>
-        <w:t xml:space="preserve"> </w:t>
-      </w:r>
-      <w:r>
-        <w:t xml:space="preserve">-</w:t>
-      </w:r>
-      <w:r>
-        <w:t xml:space="preserve"> </w:t>
+        <w:t xml:space="preserve">Key details: - </w:t>
       </w:r>
       <w:r>
         <w:rPr>
@@ -2179,19 +1693,7 @@
         <w:t xml:space="preserve">Interviewer is sync</w:t>
       </w:r>
       <w:r>
-        <w:t xml:space="preserve"> </w:t>
-      </w:r>
-      <w:r>
-        <w:t xml:space="preserve">in the turn loop — the candidate waits for its output</w:t>
-      </w:r>
-      <w:r>
-        <w:t xml:space="preserve"> </w:t>
-      </w:r>
-      <w:r>
-        <w:t xml:space="preserve">-</w:t>
-      </w:r>
-      <w:r>
-        <w:t xml:space="preserve"> </w:t>
+        <w:t xml:space="preserve"> in the turn loop — the candidate waits for its output - </w:t>
       </w:r>
       <w:r>
         <w:rPr>
@@ -2200,19 +1702,7 @@
         <w:t xml:space="preserve">Assessor is async</w:t>
       </w:r>
       <w:r>
-        <w:t xml:space="preserve"> </w:t>
-      </w:r>
-      <w:r>
-        <w:t xml:space="preserve">— does not block the next Interviewer turn (voice-ready pattern)</w:t>
-      </w:r>
-      <w:r>
-        <w:t xml:space="preserve"> </w:t>
-      </w:r>
-      <w:r>
-        <w:t xml:space="preserve">-</w:t>
-      </w:r>
-      <w:r>
-        <w:t xml:space="preserve"> </w:t>
+        <w:t xml:space="preserve"> — does not block the next Interviewer turn (voice-ready pattern) - </w:t>
       </w:r>
       <w:r>
         <w:rPr>
@@ -2221,10 +1711,7 @@
         <w:t xml:space="preserve">The orchestrator makes transition decisions</w:t>
       </w:r>
       <w:r>
-        <w:t xml:space="preserve"> </w:t>
-      </w:r>
-      <w:r>
-        <w:t xml:space="preserve">(probe / move-on / close) based on the plan, remaining time budget, and Assessor results when available</w:t>
+        <w:t xml:space="preserve"> (probe / move-on / close) based on the plan, remaining time budget, and Assessor results when available</w:t>
       </w:r>
     </w:p>
     <w:p>
@@ -2297,10 +1784,7 @@
         <w:pStyle w:val="BodyText"/>
       </w:pPr>
       <w:r>
-        <w:t xml:space="preserve">After sign-off the session is marked</w:t>
-      </w:r>
-      <w:r>
-        <w:t xml:space="preserve"> </w:t>
+        <w:t xml:space="preserve">After sign-off the session is marked </w:t>
       </w:r>
       <w:r>
         <w:rPr>
@@ -2309,10 +1793,7 @@
         <w:t xml:space="preserve">annotated=true</w:t>
       </w:r>
       <w:r>
-        <w:t xml:space="preserve"> </w:t>
-      </w:r>
-      <w:r>
-        <w:t xml:space="preserve">and enters the embedding-indexing pipeline (for future RAG).</w:t>
+        <w:t xml:space="preserve"> and enters the embedding-indexing pipeline (for future RAG).</w:t>
       </w:r>
     </w:p>
     <w:p>
@@ -2355,10 +1836,7 @@
         <w:t xml:space="preserve">ADR-001</w:t>
       </w:r>
       <w:r>
-        <w:t xml:space="preserve"> </w:t>
-      </w:r>
-      <w:r>
-        <w:t xml:space="preserve">— Vertex AI Model Garden as the LLM platform (vs direct Anthropic / OpenAI APIs)</w:t>
+        <w:t xml:space="preserve"> — Vertex AI Model Garden as the LLM platform (vs direct Anthropic / OpenAI APIs)</w:t>
       </w:r>
     </w:p>
     <w:p>
@@ -2376,10 +1854,7 @@
         <w:t xml:space="preserve">ADR-002</w:t>
       </w:r>
       <w:r>
-        <w:t xml:space="preserve"> </w:t>
-      </w:r>
-      <w:r>
-        <w:t xml:space="preserve">— 2+1 agent architecture (Interviewer + Assessor + Planner) vs a single multi-tool agent</w:t>
+        <w:t xml:space="preserve"> — 2+1 agent architecture (Interviewer + Assessor + Planner) vs a single multi-tool agent</w:t>
       </w:r>
     </w:p>
     <w:p>
@@ -2397,10 +1872,7 @@
         <w:t xml:space="preserve">ADR-003</w:t>
       </w:r>
       <w:r>
-        <w:t xml:space="preserve"> </w:t>
-      </w:r>
-      <w:r>
-        <w:t xml:space="preserve">— Hybrid InterviewPlan (neither full script nor full adaptivity)</w:t>
+        <w:t xml:space="preserve"> — Hybrid InterviewPlan (neither full script nor full adaptivity)</w:t>
       </w:r>
     </w:p>
     <w:p>
@@ -2418,10 +1890,7 @@
         <w:t xml:space="preserve">ADR-004</w:t>
       </w:r>
       <w:r>
-        <w:t xml:space="preserve"> </w:t>
-      </w:r>
-      <w:r>
-        <w:t xml:space="preserve">— English system prompts + Ukrainian candidate-facing output</w:t>
+        <w:t xml:space="preserve"> — English system prompts + Ukrainian candidate-facing output</w:t>
       </w:r>
     </w:p>
     <w:p>
@@ -2439,10 +1908,7 @@
         <w:t xml:space="preserve">ADR-005</w:t>
       </w:r>
       <w:r>
-        <w:t xml:space="preserve"> </w:t>
-      </w:r>
-      <w:r>
-        <w:t xml:space="preserve">— Deterministic state machine in code, not LLM-driven orchestration</w:t>
+        <w:t xml:space="preserve"> — Deterministic state machine in code, not LLM-driven orchestration</w:t>
       </w:r>
     </w:p>
     <w:p>
@@ -2460,10 +1926,7 @@
         <w:t xml:space="preserve">ADR-006</w:t>
       </w:r>
       <w:r>
-        <w:t xml:space="preserve"> </w:t>
-      </w:r>
-      <w:r>
-        <w:t xml:space="preserve">— Configs-as-Code (YAML in Git) for rubric / positions / prompts</w:t>
+        <w:t xml:space="preserve"> — Configs-as-Code (YAML in Git) for rubric / positions / prompts</w:t>
       </w:r>
     </w:p>
     <w:p>
@@ -2481,10 +1944,7 @@
         <w:t xml:space="preserve">ADR-007</w:t>
       </w:r>
       <w:r>
-        <w:t xml:space="preserve"> </w:t>
-      </w:r>
-      <w:r>
-        <w:t xml:space="preserve">— Async assessment pattern (voice-ready)</w:t>
+        <w:t xml:space="preserve"> — Async assessment pattern (voice-ready)</w:t>
       </w:r>
     </w:p>
     <w:p>
@@ -2502,10 +1962,7 @@
         <w:t xml:space="preserve">ADR-008</w:t>
       </w:r>
       <w:r>
-        <w:t xml:space="preserve"> </w:t>
-      </w:r>
-      <w:r>
-        <w:t xml:space="preserve">— pgvector on Cloud SQL vs a separate Vector Search (cost-first; re-evaluate later)</w:t>
+        <w:t xml:space="preserve"> — pgvector on Cloud SQL vs a separate Vector Search (cost-first; re-evaluate later)</w:t>
       </w:r>
     </w:p>
     <w:p>
@@ -2591,13 +2048,7 @@
         <w:t xml:space="preserve">Environments:</w:t>
       </w:r>
       <w:r>
-        <w:t xml:space="preserve"> </w:t>
-      </w:r>
-      <w:r>
-        <w:t xml:space="preserve">-</w:t>
-      </w:r>
-      <w:r>
-        <w:t xml:space="preserve"> </w:t>
+        <w:t xml:space="preserve"> - </w:t>
       </w:r>
       <w:r>
         <w:rPr>
@@ -2606,19 +2057,7 @@
         <w:t xml:space="preserve">Local</w:t>
       </w:r>
       <w:r>
-        <w:t xml:space="preserve"> </w:t>
-      </w:r>
-      <w:r>
-        <w:t xml:space="preserve">— dev machine + docker-compose Postgres + real Vertex (sandbox project)</w:t>
-      </w:r>
-      <w:r>
-        <w:t xml:space="preserve"> </w:t>
-      </w:r>
-      <w:r>
-        <w:t xml:space="preserve">-</w:t>
-      </w:r>
-      <w:r>
-        <w:t xml:space="preserve"> </w:t>
+        <w:t xml:space="preserve"> — dev machine + docker-compose Postgres + real Vertex (sandbox project) - </w:t>
       </w:r>
       <w:r>
         <w:rPr>
@@ -2627,19 +2066,7 @@
         <w:t xml:space="preserve">Staging</w:t>
       </w:r>
       <w:r>
-        <w:t xml:space="preserve"> </w:t>
-      </w:r>
-      <w:r>
-        <w:t xml:space="preserve">— separate GCP project, Cloud Run + Cloud SQL + real Vertex</w:t>
-      </w:r>
-      <w:r>
-        <w:t xml:space="preserve"> </w:t>
-      </w:r>
-      <w:r>
-        <w:t xml:space="preserve">-</w:t>
-      </w:r>
-      <w:r>
-        <w:t xml:space="preserve"> </w:t>
+        <w:t xml:space="preserve"> — separate GCP project, Cloud Run + Cloud SQL + real Vertex - </w:t>
       </w:r>
       <w:r>
         <w:rPr>
@@ -2648,10 +2075,7 @@
         <w:t xml:space="preserve">Production</w:t>
       </w:r>
       <w:r>
-        <w:t xml:space="preserve"> </w:t>
-      </w:r>
-      <w:r>
-        <w:t xml:space="preserve">— separate GCP project for isolation (pilot runs here)</w:t>
+        <w:t xml:space="preserve"> — separate GCP project for isolation (pilot runs here)</w:t>
       </w:r>
     </w:p>
     <w:p>
@@ -2682,37 +2106,7 @@
         <w:t xml:space="preserve">Privacy:</w:t>
       </w:r>
       <w:r>
-        <w:t xml:space="preserve"> </w:t>
-      </w:r>
-      <w:r>
-        <w:t xml:space="preserve">- Vertex enterprise contract: no data used for model training</w:t>
-      </w:r>
-      <w:r>
-        <w:t xml:space="preserve"> </w:t>
-      </w:r>
-      <w:r>
-        <w:t xml:space="preserve">- Explicit consent gate before session start</w:t>
-      </w:r>
-      <w:r>
-        <w:t xml:space="preserve"> </w:t>
-      </w:r>
-      <w:r>
-        <w:t xml:space="preserve">- Data retention: 90 days for the pilot (MVP); production TBD per GDPR baseline</w:t>
-      </w:r>
-      <w:r>
-        <w:t xml:space="preserve"> </w:t>
-      </w:r>
-      <w:r>
-        <w:t xml:space="preserve">- Delete-on-request endpoint</w:t>
-      </w:r>
-      <w:r>
-        <w:t xml:space="preserve"> </w:t>
-      </w:r>
-      <w:r>
-        <w:t xml:space="preserve">- No candidate PII in TurnTrace (only</w:t>
-      </w:r>
-      <w:r>
-        <w:t xml:space="preserve"> </w:t>
+        <w:t xml:space="preserve"> - Vertex enterprise contract: no data used for model training - Explicit consent gate before session start - Data retention: 90 days for the pilot (MVP); production TBD per GDPR baseline - Delete-on-request endpoint - No candidate PII in TurnTrace (only </w:t>
       </w:r>
       <w:r>
         <w:rPr>
@@ -2721,10 +2115,7 @@
         <w:t xml:space="preserve">candidate_id</w:t>
       </w:r>
       <w:r>
-        <w:t xml:space="preserve"> </w:t>
-      </w:r>
-      <w:r>
-        <w:t xml:space="preserve">pseudonym)</w:t>
+        <w:t xml:space="preserve"> pseudonym)</w:t>
       </w:r>
     </w:p>
     <w:p>
@@ -2738,28 +2129,7 @@
         <w:t xml:space="preserve">Safety:</w:t>
       </w:r>
       <w:r>
-        <w:t xml:space="preserve"> </w:t>
-      </w:r>
-      <w:r>
-        <w:t xml:space="preserve">- Prompt-injection defense: scope guard in the system prompt + input normalization</w:t>
-      </w:r>
-      <w:r>
-        <w:t xml:space="preserve"> </w:t>
-      </w:r>
-      <w:r>
-        <w:t xml:space="preserve">- Rate limiting per candidate token</w:t>
-      </w:r>
-      <w:r>
-        <w:t xml:space="preserve"> </w:t>
-      </w:r>
-      <w:r>
-        <w:t xml:space="preserve">- All secrets accessed via Secret Manager only</w:t>
-      </w:r>
-      <w:r>
-        <w:t xml:space="preserve"> </w:t>
-      </w:r>
-      <w:r>
-        <w:t xml:space="preserve">- Strict JSON schema validation on every agent output</w:t>
+        <w:t xml:space="preserve"> - Prompt-injection defense: scope guard in the system prompt + input normalization - Rate limiting per candidate token - All secrets accessed via Secret Manager only - Strict JSON schema validation on every agent output</w:t>
       </w:r>
     </w:p>
     <w:p>
@@ -2773,13 +2143,7 @@
         <w:t xml:space="preserve">Observability commitments:</w:t>
       </w:r>
       <w:r>
-        <w:t xml:space="preserve"> </w:t>
-      </w:r>
-      <w:r>
-        <w:t xml:space="preserve">-</w:t>
-      </w:r>
-      <w:r>
-        <w:t xml:space="preserve"> </w:t>
+        <w:t xml:space="preserve"> - </w:t>
       </w:r>
       <w:r>
         <w:rPr>
@@ -2788,37 +2152,7 @@
         <w:t xml:space="preserve">100% TurnTrace capture</w:t>
       </w:r>
       <w:r>
-        <w:t xml:space="preserve"> </w:t>
-      </w:r>
-      <w:r>
-        <w:t xml:space="preserve">— a hard requirement, enforced by alert</w:t>
-      </w:r>
-      <w:r>
-        <w:t xml:space="preserve"> </w:t>
-      </w:r>
-      <w:r>
-        <w:t xml:space="preserve">- Cost per session / per agent / per model — first-class metric</w:t>
-      </w:r>
-      <w:r>
-        <w:t xml:space="preserve"> </w:t>
-      </w:r>
-      <w:r>
-        <w:t xml:space="preserve">- Agent p95 latency — first-class metric</w:t>
-      </w:r>
-      <w:r>
-        <w:t xml:space="preserve"> </w:t>
-      </w:r>
-      <w:r>
-        <w:t xml:space="preserve">- Error rate alert &gt; 5%</w:t>
-      </w:r>
-      <w:r>
-        <w:t xml:space="preserve"> </w:t>
-      </w:r>
-      <w:r>
-        <w:t xml:space="preserve">-</w:t>
-      </w:r>
-      <w:r>
-        <w:t xml:space="preserve"> </w:t>
+        <w:t xml:space="preserve"> — a hard requirement, enforced by alert - Cost per session / per agent / per model — first-class metric - Agent p95 latency — first-class metric - Error rate alert &gt; 5% - </w:t>
       </w:r>
       <w:r>
         <w:rPr>
@@ -2827,10 +2161,7 @@
         <w:t xml:space="preserve">prompt_version</w:t>
       </w:r>
       <w:r>
-        <w:t xml:space="preserve"> </w:t>
-      </w:r>
-      <w:r>
-        <w:t xml:space="preserve">label on every TurnTrace (for post-hoc A/B)</w:t>
+        <w:t xml:space="preserve"> label on every TurnTrace (for post-hoc A/B)</w:t>
       </w:r>
     </w:p>
     <w:p>
@@ -2861,46 +2192,7 @@
         <w:t xml:space="preserve">MVP constraints:</w:t>
       </w:r>
       <w:r>
-        <w:t xml:space="preserve"> </w:t>
-      </w:r>
-      <w:r>
-        <w:t xml:space="preserve">- Text-only interaction</w:t>
-      </w:r>
-      <w:r>
-        <w:t xml:space="preserve"> </w:t>
-      </w:r>
-      <w:r>
-        <w:t xml:space="preserve">- Only 2 stacks (C#, React)</w:t>
-      </w:r>
-      <w:r>
-        <w:t xml:space="preserve"> </w:t>
-      </w:r>
-      <w:r>
-        <w:t xml:space="preserve">- No advanced anti-cheating</w:t>
-      </w:r>
-      <w:r>
-        <w:t xml:space="preserve"> </w:t>
-      </w:r>
-      <w:r>
-        <w:t xml:space="preserve">- No candidate account (magic-link only)</w:t>
-      </w:r>
-      <w:r>
-        <w:t xml:space="preserve"> </w:t>
-      </w:r>
-      <w:r>
-        <w:t xml:space="preserve">- No RAG feature-on</w:t>
-      </w:r>
-      <w:r>
-        <w:t xml:space="preserve"> </w:t>
-      </w:r>
-      <w:r>
-        <w:t xml:space="preserve">- Configs-as-Code only (no rubric admin UI)</w:t>
-      </w:r>
-      <w:r>
-        <w:t xml:space="preserve"> </w:t>
-      </w:r>
-      <w:r>
-        <w:t xml:space="preserve">- Internal-only (SSO-restricted)</w:t>
+        <w:t xml:space="preserve"> - Text-only interaction - Only 2 stacks (C#, React) - No advanced anti-cheating - No candidate account (magic-link only) - No RAG feature-on - Configs-as-Code only (no rubric admin UI) - Internal-only (SSO-restricted)</w:t>
       </w:r>
     </w:p>
     <w:p>
@@ -2914,46 +2206,7 @@
         <w:t xml:space="preserve">Voice-ready guardrails (enforced from W1):</w:t>
       </w:r>
       <w:r>
-        <w:t xml:space="preserve"> </w:t>
-      </w:r>
-      <w:r>
-        <w:t xml:space="preserve">1. WebSocket-first transport (not HTTP polling)</w:t>
-      </w:r>
-      <w:r>
-        <w:t xml:space="preserve"> </w:t>
-      </w:r>
-      <w:r>
-        <w:t xml:space="preserve">2. Async assessment (does not block the next turn)</w:t>
-      </w:r>
-      <w:r>
-        <w:t xml:space="preserve"> </w:t>
-      </w:r>
-      <w:r>
-        <w:t xml:space="preserve">3. Streaming token output from the Interviewer</w:t>
-      </w:r>
-      <w:r>
-        <w:t xml:space="preserve"> </w:t>
-      </w:r>
-      <w:r>
-        <w:t xml:space="preserve">4. Latency budget as a first-class metric</w:t>
-      </w:r>
-      <w:r>
-        <w:t xml:space="preserve"> </w:t>
-      </w:r>
-      <w:r>
-        <w:t xml:space="preserve">5. Transport-agnostic core (the orchestrator is unaware of text vs voice)</w:t>
-      </w:r>
-      <w:r>
-        <w:t xml:space="preserve"> </w:t>
-      </w:r>
-      <w:r>
-        <w:t xml:space="preserve">6. Full transcript preserved (once voice is added, text remains the source of truth)</w:t>
-      </w:r>
-      <w:r>
-        <w:t xml:space="preserve"> </w:t>
-      </w:r>
-      <w:r>
-        <w:t xml:space="preserve">7. Interruption-friendly turn structure (short turns, explicit stop tokens)</w:t>
+        <w:t xml:space="preserve"> 1. WebSocket-first transport (not HTTP polling) 2. Async assessment (does not block the next turn) 3. Streaming token output from the Interviewer 4. Latency budget as a first-class metric 5. Transport-agnostic core (the orchestrator is unaware of text vs voice) 6. Full transcript preserved (once voice is added, text remains the source of truth) 7. Interruption-friendly turn structure (short turns, explicit stop tokens)</w:t>
       </w:r>
     </w:p>
     <w:p>
@@ -2978,10 +2231,7 @@
         <w:pStyle w:val="FirstParagraph"/>
       </w:pPr>
       <w:r>
-        <w:t xml:space="preserve">Terms are used consistently across all documents. See</w:t>
-      </w:r>
-      <w:r>
-        <w:t xml:space="preserve"> </w:t>
+        <w:t xml:space="preserve">Terms are used consistently across all documents. See </w:t>
       </w:r>
       <w:r>
         <w:rPr>

</xml_diff>